<commit_message>
Agregar link del video demo
Co-Authored-By: Claude Opus 5.5 <noreply@anthropic.com>
Claude-Session: https://claude.ai/code/session_011zX6H6oj4i1EgU1wZ2bWhp
</commit_message>
<xml_diff>
--- a/entrega/Entrega-Final-Agustina-Cisneros.docx
+++ b/entrega/Entrega-Final-Agustina-Cisneros.docx
@@ -187,9 +187,15 @@
             <w:tcW w:type="dxa" w:w="4986"/>
           </w:tcPr>
           <w:p>
-            <w:r>
-              <w:t>[COMPLETAR: link del video]</w:t>
-            </w:r>
+            <w:hyperlink r:id="rId12">
+              <w:r>
+                <w:rPr>
+                  <w:color w:val="0000EE"/>
+                  <w:u w:val="single"/>
+                </w:rPr>
+                <w:t>https://drive.google.com/file/d/1jWk3e47hR2khTUuzZeiAwceMCg9LZW8d/view?usp=sharing</w:t>
+              </w:r>
+            </w:hyperlink>
           </w:p>
         </w:tc>
       </w:tr>
@@ -610,7 +616,7 @@
                     <pic:cNvPicPr/>
                   </pic:nvPicPr>
                   <pic:blipFill>
-                    <a:blip r:embed="rId12"/>
+                    <a:blip r:embed="rId13"/>
                     <a:stretch>
                       <a:fillRect/>
                     </a:stretch>

</xml_diff>

<commit_message>
Agregar link de la base en modo lectura
Co-Authored-By: Claude Opus 5.5 <noreply@anthropic.com>
Claude-Session: https://claude.ai/code/session_011zX6H6oj4i1EgU1wZ2bWhp
</commit_message>
<xml_diff>
--- a/entrega/Entrega-Final-Agustina-Cisneros.docx
+++ b/entrega/Entrega-Final-Agustina-Cisneros.docx
@@ -100,8 +100,17 @@
             <w:tcW w:type="dxa" w:w="4986"/>
           </w:tcPr>
           <w:p>
-            <w:r>
-              <w:t>[COMPLETAR: link de solo lectura de la base]</w:t>
+            <w:hyperlink r:id="rId10">
+              <w:r>
+                <w:rPr>
+                  <w:color w:val="0000EE"/>
+                  <w:u w:val="single"/>
+                </w:rPr>
+                <w:t>https://airtable.com/appCtyPCA4QGzyXR5/shrBIC22XxubHnrfF</w:t>
+              </w:r>
+            </w:hyperlink>
+            <w:r>
+              <w:t xml:space="preserve"> (vista de solo lectura de la tabla Contenidos, tablero por Estado)</w:t>
             </w:r>
           </w:p>
         </w:tc>
@@ -125,7 +134,7 @@
             <w:tcW w:type="dxa" w:w="4986"/>
           </w:tcPr>
           <w:p>
-            <w:hyperlink r:id="rId10">
+            <w:hyperlink r:id="rId11">
               <w:r>
                 <w:rPr>
                   <w:color w:val="0000EE"/>
@@ -156,7 +165,7 @@
             <w:tcW w:type="dxa" w:w="4986"/>
           </w:tcPr>
           <w:p>
-            <w:hyperlink r:id="rId11">
+            <w:hyperlink r:id="rId12">
               <w:r>
                 <w:rPr>
                   <w:color w:val="0000EE"/>
@@ -187,7 +196,7 @@
             <w:tcW w:type="dxa" w:w="4986"/>
           </w:tcPr>
           <w:p>
-            <w:hyperlink r:id="rId12">
+            <w:hyperlink r:id="rId13">
               <w:r>
                 <w:rPr>
                   <w:color w:val="0000EE"/>
@@ -616,7 +625,7 @@
                     <pic:cNvPicPr/>
                   </pic:nvPicPr>
                   <pic:blipFill>
-                    <a:blip r:embed="rId13"/>
+                    <a:blip r:embed="rId14"/>
                     <a:stretch>
                       <a:fillRect/>
                     </a:stretch>

</xml_diff>

<commit_message>
Agregar capturas de evidencia del intento 2 al documento y al repositorio
Co-Authored-By: Claude Opus 5.5 <noreply@anthropic.com>
Claude-Session: https://claude.ai/code/session_011zX6H6oj4i1EgU1wZ2bWhp
</commit_message>
<xml_diff>
--- a/entrega/Entrega-Final-Agustina-Cisneros.docx
+++ b/entrega/Entrega-Final-Agustina-Cisneros.docx
@@ -8951,19 +8951,46 @@
         <w:pStyle w:val="Heading2"/>
       </w:pPr>
       <w:r>
-        <w:t>7.1 Workflow único en n8n (flujo principal + subworkflows)</w:t>
+        <w:t>7.1 Workflow único en n8n: flujo principal (azul) + subworkflows (verde)</w:t>
       </w:r>
     </w:p>
     <w:p>
       <w:r/>
-      <w:r>
-        <w:rPr>
-          <w:b/>
-        </w:rPr>
-        <w:t>📸 PEGAR ACÁ LA CAPTURA:</w:t>
-      </w:r>
-      <w:r>
-        <w:t xml:space="preserve"> el lienzo completo del workflow en n8n (bloque azul y bloque verde)</w:t>
+    </w:p>
+    <w:p>
+      <w:r>
+        <w:drawing>
+          <wp:inline xmlns:a="http://schemas.openxmlformats.org/drawingml/2006/main" xmlns:pic="http://schemas.openxmlformats.org/drawingml/2006/picture">
+            <wp:extent cx="30480000" cy="19050000"/>
+            <wp:docPr id="2" name="Picture 2"/>
+            <wp:cNvGraphicFramePr>
+              <a:graphicFrameLocks noChangeAspect="1"/>
+            </wp:cNvGraphicFramePr>
+            <a:graphic>
+              <a:graphicData uri="http://schemas.openxmlformats.org/drawingml/2006/picture">
+                <pic:pic>
+                  <pic:nvPicPr>
+                    <pic:cNvPr id="0" name="workflow-n8n-canvas.png"/>
+                    <pic:cNvPicPr/>
+                  </pic:nvPicPr>
+                  <pic:blipFill>
+                    <a:blip r:embed="rId15"/>
+                    <a:stretch>
+                      <a:fillRect/>
+                    </a:stretch>
+                  </pic:blipFill>
+                  <pic:spPr>
+                    <a:xfrm>
+                      <a:off x="0" y="0"/>
+                      <a:ext cx="30480000" cy="19050000"/>
+                    </a:xfrm>
+                    <a:prstGeom prst="rect"/>
+                  </pic:spPr>
+                </pic:pic>
+              </a:graphicData>
+            </a:graphic>
+          </wp:inline>
+        </w:drawing>
       </w:r>
     </w:p>
     <w:p>
@@ -8971,25 +8998,46 @@
         <w:pStyle w:val="Heading2"/>
       </w:pPr>
       <w:r>
-        <w:t>7.2 HITL: la ejecución PAUSADA esperando la decisión humana</w:t>
+        <w:t>7.2 HITL: la ejecución queda PAUSADA (“Esperando”) hasta la decisión humana</w:t>
       </w:r>
     </w:p>
     <w:p>
       <w:r/>
-      <w:r>
-        <w:rPr>
-          <w:b/>
-        </w:rPr>
-        <w:t>📸 PEGAR ACÁ LA CAPTURA:</w:t>
-      </w:r>
-      <w:r>
-        <w:t xml:space="preserve"> n8n → Ejecuciones, con la ejecución en estado </w:t>
-      </w:r>
-      <w:r>
-        <w:rPr>
-          <w:b/>
-        </w:rPr>
-        <w:t>“Esperando”</w:t>
+    </w:p>
+    <w:p>
+      <w:r>
+        <w:drawing>
+          <wp:inline xmlns:a="http://schemas.openxmlformats.org/drawingml/2006/main" xmlns:pic="http://schemas.openxmlformats.org/drawingml/2006/picture">
+            <wp:extent cx="18278475" cy="8705850"/>
+            <wp:docPr id="3" name="Picture 3"/>
+            <wp:cNvGraphicFramePr>
+              <a:graphicFrameLocks noChangeAspect="1"/>
+            </wp:cNvGraphicFramePr>
+            <a:graphic>
+              <a:graphicData uri="http://schemas.openxmlformats.org/drawingml/2006/picture">
+                <pic:pic>
+                  <pic:nvPicPr>
+                    <pic:cNvPr id="0" name="img03.png"/>
+                    <pic:cNvPicPr/>
+                  </pic:nvPicPr>
+                  <pic:blipFill>
+                    <a:blip r:embed="rId16"/>
+                    <a:stretch>
+                      <a:fillRect/>
+                    </a:stretch>
+                  </pic:blipFill>
+                  <pic:spPr>
+                    <a:xfrm>
+                      <a:off x="0" y="0"/>
+                      <a:ext cx="18278475" cy="8705850"/>
+                    </a:xfrm>
+                    <a:prstGeom prst="rect"/>
+                  </pic:spPr>
+                </pic:pic>
+              </a:graphicData>
+            </a:graphic>
+          </wp:inline>
+        </w:drawing>
       </w:r>
     </w:p>
     <w:p>
@@ -8997,19 +9045,85 @@
         <w:pStyle w:val="Heading2"/>
       </w:pPr>
       <w:r>
-        <w:t>7.3 HITL: mensaje de aprobación en Slack</w:t>
+        <w:t>7.3 HITL: mensaje de aprobación en Slack con los botones Rechazar / Aprobar y publicar</w:t>
       </w:r>
     </w:p>
     <w:p>
       <w:r/>
-      <w:r>
-        <w:rPr>
-          <w:b/>
-        </w:rPr>
-        <w:t>📸 PEGAR ACÁ LA CAPTURA:</w:t>
-      </w:r>
-      <w:r>
-        <w:t xml:space="preserve"> el mensaje “🛑 Aprobación requerida — el flujo está pausado” con los botones ❌ Rechazar / ✅ Aprobar y publicar</w:t>
+    </w:p>
+    <w:p>
+      <w:r>
+        <w:drawing>
+          <wp:inline xmlns:a="http://schemas.openxmlformats.org/drawingml/2006/main" xmlns:pic="http://schemas.openxmlformats.org/drawingml/2006/picture">
+            <wp:extent cx="18278475" cy="8696325"/>
+            <wp:docPr id="4" name="Picture 4"/>
+            <wp:cNvGraphicFramePr>
+              <a:graphicFrameLocks noChangeAspect="1"/>
+            </wp:cNvGraphicFramePr>
+            <a:graphic>
+              <a:graphicData uri="http://schemas.openxmlformats.org/drawingml/2006/picture">
+                <pic:pic>
+                  <pic:nvPicPr>
+                    <pic:cNvPr id="0" name="img02.png"/>
+                    <pic:cNvPicPr/>
+                  </pic:nvPicPr>
+                  <pic:blipFill>
+                    <a:blip r:embed="rId17"/>
+                    <a:stretch>
+                      <a:fillRect/>
+                    </a:stretch>
+                  </pic:blipFill>
+                  <pic:spPr>
+                    <a:xfrm>
+                      <a:off x="0" y="0"/>
+                      <a:ext cx="18278475" cy="8696325"/>
+                    </a:xfrm>
+                    <a:prstGeom prst="rect"/>
+                  </pic:spPr>
+                </pic:pic>
+              </a:graphicData>
+            </a:graphic>
+          </wp:inline>
+        </w:drawing>
+      </w:r>
+    </w:p>
+    <w:p>
+      <w:r/>
+    </w:p>
+    <w:p>
+      <w:r>
+        <w:drawing>
+          <wp:inline xmlns:a="http://schemas.openxmlformats.org/drawingml/2006/main" xmlns:pic="http://schemas.openxmlformats.org/drawingml/2006/picture">
+            <wp:extent cx="13458825" cy="3848099"/>
+            <wp:docPr id="5" name="Picture 5"/>
+            <wp:cNvGraphicFramePr>
+              <a:graphicFrameLocks noChangeAspect="1"/>
+            </wp:cNvGraphicFramePr>
+            <a:graphic>
+              <a:graphicData uri="http://schemas.openxmlformats.org/drawingml/2006/picture">
+                <pic:pic>
+                  <pic:nvPicPr>
+                    <pic:cNvPr id="0" name="img06.png"/>
+                    <pic:cNvPicPr/>
+                  </pic:nvPicPr>
+                  <pic:blipFill>
+                    <a:blip r:embed="rId18"/>
+                    <a:stretch>
+                      <a:fillRect/>
+                    </a:stretch>
+                  </pic:blipFill>
+                  <pic:spPr>
+                    <a:xfrm>
+                      <a:off x="0" y="0"/>
+                      <a:ext cx="13458825" cy="3848099"/>
+                    </a:xfrm>
+                    <a:prstGeom prst="rect"/>
+                  </pic:spPr>
+                </pic:pic>
+              </a:graphicData>
+            </a:graphic>
+          </wp:inline>
+        </w:drawing>
       </w:r>
     </w:p>
     <w:p>
@@ -9017,19 +9131,46 @@
         <w:pStyle w:val="Heading2"/>
       </w:pPr>
       <w:r>
-        <w:t>7.4 Borrador generado por la IA con RAG</w:t>
+        <w:t>7.4 Después del clic en Aprobar: la ejecución termina y corre SUB 2 · Publicación</w:t>
       </w:r>
     </w:p>
     <w:p>
       <w:r/>
-      <w:r>
-        <w:rPr>
-          <w:b/>
-        </w:rPr>
-        <w:t>📸 PEGAR ACÁ LA CAPTURA:</w:t>
-      </w:r>
-      <w:r>
-        <w:t xml:space="preserve"> el mensaje “📋 Nueva pieza para revisar” con el borrador</w:t>
+    </w:p>
+    <w:p>
+      <w:r>
+        <w:drawing>
+          <wp:inline xmlns:a="http://schemas.openxmlformats.org/drawingml/2006/main" xmlns:pic="http://schemas.openxmlformats.org/drawingml/2006/picture">
+            <wp:extent cx="18268950" cy="8743950"/>
+            <wp:docPr id="6" name="Picture 6"/>
+            <wp:cNvGraphicFramePr>
+              <a:graphicFrameLocks noChangeAspect="1"/>
+            </wp:cNvGraphicFramePr>
+            <a:graphic>
+              <a:graphicData uri="http://schemas.openxmlformats.org/drawingml/2006/picture">
+                <pic:pic>
+                  <pic:nvPicPr>
+                    <pic:cNvPr id="0" name="img04.png"/>
+                    <pic:cNvPicPr/>
+                  </pic:nvPicPr>
+                  <pic:blipFill>
+                    <a:blip r:embed="rId19"/>
+                    <a:stretch>
+                      <a:fillRect/>
+                    </a:stretch>
+                  </pic:blipFill>
+                  <pic:spPr>
+                    <a:xfrm>
+                      <a:off x="0" y="0"/>
+                      <a:ext cx="18268950" cy="8743950"/>
+                    </a:xfrm>
+                    <a:prstGeom prst="rect"/>
+                  </pic:spPr>
+                </pic:pic>
+              </a:graphicData>
+            </a:graphic>
+          </wp:inline>
+        </w:drawing>
       </w:r>
     </w:p>
     <w:p>
@@ -9037,19 +9178,46 @@
         <w:pStyle w:val="Heading2"/>
       </w:pPr>
       <w:r>
-        <w:t>7.5 Salida: publicación en #contenido-publicado</w:t>
+        <w:t>7.5 Salida: publicación automática en #contenido-publicado</w:t>
       </w:r>
     </w:p>
     <w:p>
       <w:r/>
-      <w:r>
-        <w:rPr>
-          <w:b/>
-        </w:rPr>
-        <w:t>📸 PEGAR ACÁ LA CAPTURA:</w:t>
-      </w:r>
-      <w:r>
-        <w:t xml:space="preserve"> el post “✅ Publicado (LinkedIn) — Tips de organización para freelancers”</w:t>
+    </w:p>
+    <w:p>
+      <w:r>
+        <w:drawing>
+          <wp:inline xmlns:a="http://schemas.openxmlformats.org/drawingml/2006/main" xmlns:pic="http://schemas.openxmlformats.org/drawingml/2006/picture">
+            <wp:extent cx="18154650" cy="6524625"/>
+            <wp:docPr id="7" name="Picture 7"/>
+            <wp:cNvGraphicFramePr>
+              <a:graphicFrameLocks noChangeAspect="1"/>
+            </wp:cNvGraphicFramePr>
+            <a:graphic>
+              <a:graphicData uri="http://schemas.openxmlformats.org/drawingml/2006/picture">
+                <pic:pic>
+                  <pic:nvPicPr>
+                    <pic:cNvPr id="0" name="img05.png"/>
+                    <pic:cNvPicPr/>
+                  </pic:nvPicPr>
+                  <pic:blipFill>
+                    <a:blip r:embed="rId20"/>
+                    <a:stretch>
+                      <a:fillRect/>
+                    </a:stretch>
+                  </pic:blipFill>
+                  <pic:spPr>
+                    <a:xfrm>
+                      <a:off x="0" y="0"/>
+                      <a:ext cx="18154650" cy="6524625"/>
+                    </a:xfrm>
+                    <a:prstGeom prst="rect"/>
+                  </pic:spPr>
+                </pic:pic>
+              </a:graphicData>
+            </a:graphic>
+          </wp:inline>
+        </w:drawing>
       </w:r>
     </w:p>
     <w:p>
@@ -9057,19 +9225,46 @@
         <w:pStyle w:val="Heading2"/>
       </w:pPr>
       <w:r>
-        <w:t>7.6 Rechazo humano</w:t>
+        <w:t>7.6 Rechazo humano: la pieza queda en Estado Rechazado y no se publica</w:t>
       </w:r>
     </w:p>
     <w:p>
       <w:r/>
-      <w:r>
-        <w:rPr>
-          <w:b/>
-        </w:rPr>
-        <w:t>📸 PEGAR ACÁ LA CAPTURA:</w:t>
-      </w:r>
-      <w:r>
-        <w:t xml:space="preserve"> la fila “Cómo fijar tus tarifas como freelancer” en Estado Rechazado (y la respuesta “❌ Rechazado” en el hilo)</w:t>
+    </w:p>
+    <w:p>
+      <w:r>
+        <w:drawing>
+          <wp:inline xmlns:a="http://schemas.openxmlformats.org/drawingml/2006/main" xmlns:pic="http://schemas.openxmlformats.org/drawingml/2006/picture">
+            <wp:extent cx="13554075" cy="2324100"/>
+            <wp:docPr id="8" name="Picture 8"/>
+            <wp:cNvGraphicFramePr>
+              <a:graphicFrameLocks noChangeAspect="1"/>
+            </wp:cNvGraphicFramePr>
+            <a:graphic>
+              <a:graphicData uri="http://schemas.openxmlformats.org/drawingml/2006/picture">
+                <pic:pic>
+                  <pic:nvPicPr>
+                    <pic:cNvPr id="0" name="img07.png"/>
+                    <pic:cNvPicPr/>
+                  </pic:nvPicPr>
+                  <pic:blipFill>
+                    <a:blip r:embed="rId21"/>
+                    <a:stretch>
+                      <a:fillRect/>
+                    </a:stretch>
+                  </pic:blipFill>
+                  <pic:spPr>
+                    <a:xfrm>
+                      <a:off x="0" y="0"/>
+                      <a:ext cx="13554075" cy="2324100"/>
+                    </a:xfrm>
+                    <a:prstGeom prst="rect"/>
+                  </pic:spPr>
+                </pic:pic>
+              </a:graphicData>
+            </a:graphic>
+          </wp:inline>
+        </w:drawing>
       </w:r>
     </w:p>
     <w:p>
@@ -9077,19 +9272,46 @@
         <w:pStyle w:val="Heading2"/>
       </w:pPr>
       <w:r>
-        <w:t>7.7 Camino infeliz: dato faltante</w:t>
+        <w:t>7.7 Camino infeliz: Idea Semilla vacía → error controlado (no se llama a la IA)</w:t>
       </w:r>
     </w:p>
     <w:p>
       <w:r/>
-      <w:r>
-        <w:rPr>
-          <w:b/>
-        </w:rPr>
-        <w:t>📸 PEGAR ACÁ LA CAPTURA:</w:t>
-      </w:r>
-      <w:r>
-        <w:t xml:space="preserve"> la alerta 🚨 “Datos faltantes/incompletos: Idea Semilla vacía”</w:t>
+    </w:p>
+    <w:p>
+      <w:r>
+        <w:drawing>
+          <wp:inline xmlns:a="http://schemas.openxmlformats.org/drawingml/2006/main" xmlns:pic="http://schemas.openxmlformats.org/drawingml/2006/picture">
+            <wp:extent cx="17192625" cy="6524625"/>
+            <wp:docPr id="9" name="Picture 9"/>
+            <wp:cNvGraphicFramePr>
+              <a:graphicFrameLocks noChangeAspect="1"/>
+            </wp:cNvGraphicFramePr>
+            <a:graphic>
+              <a:graphicData uri="http://schemas.openxmlformats.org/drawingml/2006/picture">
+                <pic:pic>
+                  <pic:nvPicPr>
+                    <pic:cNvPr id="0" name="img08.png"/>
+                    <pic:cNvPicPr/>
+                  </pic:nvPicPr>
+                  <pic:blipFill>
+                    <a:blip r:embed="rId22"/>
+                    <a:stretch>
+                      <a:fillRect/>
+                    </a:stretch>
+                  </pic:blipFill>
+                  <pic:spPr>
+                    <a:xfrm>
+                      <a:off x="0" y="0"/>
+                      <a:ext cx="17192625" cy="6524625"/>
+                    </a:xfrm>
+                    <a:prstGeom prst="rect"/>
+                  </pic:spPr>
+                </pic:pic>
+              </a:graphicData>
+            </a:graphic>
+          </wp:inline>
+        </w:drawing>
       </w:r>
     </w:p>
     <w:p>
@@ -9097,19 +9319,46 @@
         <w:pStyle w:val="Heading2"/>
       </w:pPr>
       <w:r>
-        <w:t>7.8 Fallo real de API (Gemini 503) capturado por el Error Handler</w:t>
+        <w:t>7.8 Error Handlers: credencial sin permiso (403) y caída real de Gemini (503) registradas y alertadas</w:t>
       </w:r>
     </w:p>
     <w:p>
       <w:r/>
-      <w:r>
-        <w:rPr>
-          <w:b/>
-        </w:rPr>
-        <w:t>📸 PEGAR ACÁ LA CAPTURA:</w:t>
-      </w:r>
-      <w:r>
-        <w:t xml:space="preserve"> la alerta 🚨 con “Service unavailable” del módulo IA · Gemini</w:t>
+    </w:p>
+    <w:p>
+      <w:r>
+        <w:drawing>
+          <wp:inline xmlns:a="http://schemas.openxmlformats.org/drawingml/2006/main" xmlns:pic="http://schemas.openxmlformats.org/drawingml/2006/picture">
+            <wp:extent cx="18278475" cy="8715375"/>
+            <wp:docPr id="10" name="Picture 10"/>
+            <wp:cNvGraphicFramePr>
+              <a:graphicFrameLocks noChangeAspect="1"/>
+            </wp:cNvGraphicFramePr>
+            <a:graphic>
+              <a:graphicData uri="http://schemas.openxmlformats.org/drawingml/2006/picture">
+                <pic:pic>
+                  <pic:nvPicPr>
+                    <pic:cNvPr id="0" name="img01.png"/>
+                    <pic:cNvPicPr/>
+                  </pic:nvPicPr>
+                  <pic:blipFill>
+                    <a:blip r:embed="rId23"/>
+                    <a:stretch>
+                      <a:fillRect/>
+                    </a:stretch>
+                  </pic:blipFill>
+                  <pic:spPr>
+                    <a:xfrm>
+                      <a:off x="0" y="0"/>
+                      <a:ext cx="18278475" cy="8715375"/>
+                    </a:xfrm>
+                    <a:prstGeom prst="rect"/>
+                  </pic:spPr>
+                </pic:pic>
+              </a:graphicData>
+            </a:graphic>
+          </wp:inline>
+        </w:drawing>
       </w:r>
     </w:p>
     <w:p>
@@ -9117,19 +9366,46 @@
         <w:pStyle w:val="Heading2"/>
       </w:pPr>
       <w:r>
-        <w:t>7.9 Log de Errores vinculado a Contenidos</w:t>
+        <w:t>7.9 Log de Errores vinculado a Contenidos (relación entre tablas)</w:t>
       </w:r>
     </w:p>
     <w:p>
       <w:r/>
-      <w:r>
-        <w:rPr>
-          <w:b/>
-        </w:rPr>
-        <w:t>📸 PEGAR ACÁ LA CAPTURA:</w:t>
-      </w:r>
-      <w:r>
-        <w:t xml:space="preserve"> la tabla Log de Errores con los registros</w:t>
+    </w:p>
+    <w:p>
+      <w:r>
+        <w:drawing>
+          <wp:inline xmlns:a="http://schemas.openxmlformats.org/drawingml/2006/main" xmlns:pic="http://schemas.openxmlformats.org/drawingml/2006/picture">
+            <wp:extent cx="18230850" cy="5219700"/>
+            <wp:docPr id="11" name="Picture 11"/>
+            <wp:cNvGraphicFramePr>
+              <a:graphicFrameLocks noChangeAspect="1"/>
+            </wp:cNvGraphicFramePr>
+            <a:graphic>
+              <a:graphicData uri="http://schemas.openxmlformats.org/drawingml/2006/picture">
+                <pic:pic>
+                  <pic:nvPicPr>
+                    <pic:cNvPr id="0" name="img09.png"/>
+                    <pic:cNvPicPr/>
+                  </pic:nvPicPr>
+                  <pic:blipFill>
+                    <a:blip r:embed="rId24"/>
+                    <a:stretch>
+                      <a:fillRect/>
+                    </a:stretch>
+                  </pic:blipFill>
+                  <pic:spPr>
+                    <a:xfrm>
+                      <a:off x="0" y="0"/>
+                      <a:ext cx="18230850" cy="5219700"/>
+                    </a:xfrm>
+                    <a:prstGeom prst="rect"/>
+                  </pic:spPr>
+                </pic:pic>
+              </a:graphicData>
+            </a:graphic>
+          </wp:inline>
+        </w:drawing>
       </w:r>
     </w:p>
     <w:p>
@@ -9137,41 +9413,48 @@
         <w:pStyle w:val="Heading2"/>
       </w:pPr>
       <w:r>
-        <w:t>7.10 Tabla Contenidos con los estados</w:t>
+        <w:t>7.10 Dashboard de control (Shared View pública “KPIs del sistema”)</w:t>
       </w:r>
     </w:p>
     <w:p>
       <w:r/>
-      <w:r>
-        <w:rPr>
-          <w:b/>
-        </w:rPr>
-        <w:t>📸 PEGAR ACÁ LA CAPTURA:</w:t>
-      </w:r>
-      <w:r>
-        <w:t xml:space="preserve"> la tabla Contenidos mostrando Publicado / Rechazado / Error</w:t>
-      </w:r>
+      <w:r/>
     </w:p>
     <w:p>
-      <w:pPr>
-        <w:pStyle w:val="Heading2"/>
-      </w:pPr>
-      <w:r>
-        <w:t>7.11 Dashboard (Shared View) abierto en incógnito</w:t>
-      </w:r>
-    </w:p>
-    <w:p>
-      <w:r/>
-      <w:r>
-        <w:rPr>
-          <w:b/>
-        </w:rPr>
-        <w:t>📸 PEGAR ACÁ LA CAPTURA:</w:t>
-      </w:r>
-      <w:r>
-        <w:t xml:space="preserve"> la vista KPIs del sistema con los promedios y la suma abajo</w:t>
-      </w:r>
-      <w:r/>
+      <w:r>
+        <w:drawing>
+          <wp:inline xmlns:a="http://schemas.openxmlformats.org/drawingml/2006/main" xmlns:pic="http://schemas.openxmlformats.org/drawingml/2006/picture">
+            <wp:extent cx="18173700" cy="5200650"/>
+            <wp:docPr id="12" name="Picture 12"/>
+            <wp:cNvGraphicFramePr>
+              <a:graphicFrameLocks noChangeAspect="1"/>
+            </wp:cNvGraphicFramePr>
+            <a:graphic>
+              <a:graphicData uri="http://schemas.openxmlformats.org/drawingml/2006/picture">
+                <pic:pic>
+                  <pic:nvPicPr>
+                    <pic:cNvPr id="0" name="img10.png"/>
+                    <pic:cNvPicPr/>
+                  </pic:nvPicPr>
+                  <pic:blipFill>
+                    <a:blip r:embed="rId25"/>
+                    <a:stretch>
+                      <a:fillRect/>
+                    </a:stretch>
+                  </pic:blipFill>
+                  <pic:spPr>
+                    <a:xfrm>
+                      <a:off x="0" y="0"/>
+                      <a:ext cx="18173700" cy="5200650"/>
+                    </a:xfrm>
+                    <a:prstGeom prst="rect"/>
+                  </pic:spPr>
+                </pic:pic>
+              </a:graphicData>
+            </a:graphic>
+          </wp:inline>
+        </w:drawing>
+      </w:r>
     </w:p>
     <w:sectPr>
       <w:pgSz w:w="12240" w:h="15840"/>

</xml_diff>